<commit_message>
docs: reemplazo total de diagramas UML 2.5 eliminando referencias a Python e integrando Next.js 14 y SheetJS
</commit_message>
<xml_diff>
--- a/PPI_Cuarto_Semestre_RPA_LAD6819_FINAL.docx
+++ b/PPI_Cuarto_Semestre_RPA_LAD6819_FINAL.docx
@@ -14785,7 +14785,7 @@
       <w:r>
         <w:drawing>
           <wp:inline xmlns:a="http://schemas.openxmlformats.org/drawingml/2006/main" xmlns:pic="http://schemas.openxmlformats.org/drawingml/2006/picture">
-            <wp:extent cx="5486400" cy="3291840"/>
+            <wp:extent cx="5486400" cy="3441469"/>
             <wp:docPr id="3" name="Picture 3"/>
             <wp:cNvGraphicFramePr>
               <a:graphicFrameLocks noChangeAspect="1"/>
@@ -14806,7 +14806,7 @@
                   <pic:spPr>
                     <a:xfrm>
                       <a:off x="0" y="0"/>
-                      <a:ext cx="5486400" cy="3291840"/>
+                      <a:ext cx="5486400" cy="3441469"/>
                     </a:xfrm>
                     <a:prstGeom prst="rect"/>
                   </pic:spPr>
@@ -15169,7 +15169,7 @@
       <w:r>
         <w:drawing>
           <wp:inline xmlns:a="http://schemas.openxmlformats.org/drawingml/2006/main" xmlns:pic="http://schemas.openxmlformats.org/drawingml/2006/picture">
-            <wp:extent cx="5486400" cy="3291840"/>
+            <wp:extent cx="5486400" cy="3441469"/>
             <wp:docPr id="5" name="Picture 5"/>
             <wp:cNvGraphicFramePr>
               <a:graphicFrameLocks noChangeAspect="1"/>
@@ -15190,7 +15190,7 @@
                   <pic:spPr>
                     <a:xfrm>
                       <a:off x="0" y="0"/>
-                      <a:ext cx="5486400" cy="3291840"/>
+                      <a:ext cx="5486400" cy="3441469"/>
                     </a:xfrm>
                     <a:prstGeom prst="rect"/>
                   </pic:spPr>

</xml_diff>

<commit_message>
docs: integracion de enlace oficial de produccion Vercel en el informe PPI
</commit_message>
<xml_diff>
--- a/PPI_Cuarto_Semestre_RPA_LAD6819_FINAL.docx
+++ b/PPI_Cuarto_Semestre_RPA_LAD6819_FINAL.docx
@@ -14641,7 +14641,7 @@
         <w:br/>
         <w:t>Requisitos Mínimos de Infraestructura:</w:t>
         <w:br/>
-        <w:t>• Entorno de Servidor: Node.js versión 18 LTS o superior; compatible con hosting serverless en Vercel Edge Network o ejecución local on-premises (puerto local 3001).</w:t>
+        <w:t>• Entorno de Servidor: Node.js versión 18 LTS o superior; desplegado y operativo en Vercel Edge Network (https://fronted-rpea.vercel.app) con soporte de ejecución local on-premises (puerto local 3001).</w:t>
         <w:br/>
         <w:t>• Almacenamiento: 80 MB de espacio en disco para el paquete compilado de la aplicación; persistencia elástica en Cloud Firestore.</w:t>
         <w:br/>
@@ -15504,7 +15504,7 @@
           <w:color w:val="1E1E1E"/>
           <w:sz w:val="22"/>
         </w:rPr>
-        <w:t>El prototipo del Sistema Web RPA LAD-6819 se encuentra totalmente desarrollado, operativo y verificado en entorno local (http://localhost:3001) y en la nube. A continuación, se detallan las interfaces de usuario que componen la solución:</w:t>
+        <w:t>El prototipo del Sistema Web RPA LAD-6819 se encuentra totalmente desarrollado, operativo y verificado en su despliegue en la nube en Vercel (https://fronted-rpea.vercel.app) y en el entorno local (http://localhost:3001). A continuación, se detallan las interfaces de usuario que componen la solución:</w:t>
         <w:br/>
         <w:br/>
         <w:t>1. Pantalla de Bienvenida y Selector de Roles RBAC: Permite ingresar con credenciales o alternar de forma interactiva entre los perfiles ADMINISTRADOR, SUPERVISOR y ANALISTA, adaptando dinámicamente las opciones del menú y los niveles de permiso.</w:t>

</xml_diff>